<commit_message>
fix(content): change text layer syntax
</commit_message>
<xml_diff>
--- a/1-pydeck/MyNote.docx
+++ b/1-pydeck/MyNote.docx
@@ -137,21 +137,7 @@
           <w:b/>
           <w:bCs/>
         </w:rPr>
-        <w:t xml:space="preserve">If </w:t>
-      </w:r>
-      <w:r>
-        <w:rPr>
-          <w:b/>
-          <w:bCs/>
-        </w:rPr>
-        <w:t>intend to use it</w:t>
-      </w:r>
-      <w:r>
-        <w:rPr>
-          <w:b/>
-          <w:bCs/>
-        </w:rPr>
-        <w:t>.</w:t>
+        <w:t>If intend to use it.</w:t>
       </w:r>
     </w:p>
     <w:p>
@@ -167,6 +153,66 @@
     <w:p>
       <w:r>
         <w:t>Data utilities</w:t>
+      </w:r>
+    </w:p>
+    <w:p/>
+    <w:p/>
+    <w:p>
+      <w:pPr>
+        <w:pStyle w:val="Heading1"/>
+      </w:pPr>
+      <w:r>
+        <w:t xml:space="preserve">Deck.gl </w:t>
+      </w:r>
+    </w:p>
+    <w:p>
+      <w:hyperlink r:id="rId7" w:history="1">
+        <w:r>
+          <w:rPr>
+            <w:rStyle w:val="Hyperlink"/>
+          </w:rPr>
+          <w:t>https://deck.gl/docs</w:t>
+        </w:r>
+      </w:hyperlink>
+      <w:r>
+        <w:t xml:space="preserve"> </w:t>
+      </w:r>
+    </w:p>
+    <w:p/>
+    <w:p>
+      <w:pPr>
+        <w:rPr>
+          <w:b/>
+          <w:bCs/>
+        </w:rPr>
+      </w:pPr>
+      <w:r>
+        <w:rPr>
+          <w:b/>
+          <w:bCs/>
+        </w:rPr>
+        <w:t>Layer Parameter</w:t>
+      </w:r>
+    </w:p>
+    <w:p>
+      <w:pPr>
+        <w:rPr>
+          <w:caps/>
+        </w:rPr>
+      </w:pPr>
+      <w:hyperlink r:id="rId8" w:history="1">
+        <w:r>
+          <w:rPr>
+            <w:rStyle w:val="Hyperlink"/>
+          </w:rPr>
+          <w:t>https://deck.gl/docs/api-reference/layers</w:t>
+        </w:r>
+      </w:hyperlink>
+      <w:r>
+        <w:rPr>
+          <w:caps/>
+        </w:rPr>
+        <w:t xml:space="preserve"> </w:t>
       </w:r>
     </w:p>
     <w:sectPr>

</xml_diff>